<commit_message>
modeified setup.md file to install extension in vscode
</commit_message>
<xml_diff>
--- a/setup/env setup guide.docx
+++ b/setup/env setup guide.docx
@@ -96,15 +96,7 @@
         <w:t>,</w:t>
       </w:r>
       <w:r>
-        <w:t xml:space="preserve"> it will install </w:t>
-      </w:r>
-      <w:proofErr w:type="spellStart"/>
-      <w:r>
-        <w:t>wsl</w:t>
-      </w:r>
-      <w:proofErr w:type="spellEnd"/>
-      <w:r>
-        <w:t xml:space="preserve"> along with default ubuntu</w:t>
+        <w:t xml:space="preserve"> it will install wsl along with default ubuntu</w:t>
       </w:r>
     </w:p>
     <w:p>
@@ -116,24 +108,11 @@
         </w:numPr>
         <w:ind w:left="1800"/>
       </w:pPr>
-      <w:proofErr w:type="spellStart"/>
-      <w:r>
-        <w:t>wsl</w:t>
-      </w:r>
-      <w:proofErr w:type="spellEnd"/>
-      <w:r>
-        <w:t xml:space="preserve"> -l -</w:t>
-      </w:r>
-      <w:proofErr w:type="gramStart"/>
-      <w:r>
-        <w:t>v</w:t>
-      </w:r>
-      <w:r>
-        <w:t xml:space="preserve"> ,</w:t>
-      </w:r>
-      <w:proofErr w:type="gramEnd"/>
-      <w:r>
-        <w:t xml:space="preserve"> whether wsl2 installed or not.</w:t>
+      <w:r>
+        <w:t>wsl -l -v</w:t>
+      </w:r>
+      <w:r>
+        <w:t xml:space="preserve"> , whether wsl2 installed or not.</w:t>
       </w:r>
     </w:p>
     <w:p>
@@ -146,34 +125,13 @@
         <w:ind w:left="1800"/>
       </w:pPr>
       <w:r>
-        <w:t xml:space="preserve">in Ubuntu </w:t>
-      </w:r>
-      <w:proofErr w:type="gramStart"/>
-      <w:r>
-        <w:t>Terminal  :</w:t>
-      </w:r>
-      <w:proofErr w:type="gramEnd"/>
-      <w:r>
-        <w:t xml:space="preserve"> </w:t>
-      </w:r>
-      <w:proofErr w:type="spellStart"/>
-      <w:r>
-        <w:t>lsb_release</w:t>
-      </w:r>
-      <w:proofErr w:type="spellEnd"/>
-      <w:r>
-        <w:t xml:space="preserve"> -</w:t>
-      </w:r>
-      <w:proofErr w:type="gramStart"/>
-      <w:r>
-        <w:t>a</w:t>
-      </w:r>
-      <w:r>
-        <w:t xml:space="preserve">  ,</w:t>
-      </w:r>
-      <w:proofErr w:type="gramEnd"/>
-      <w:r>
-        <w:t xml:space="preserve"> details which Ubuntu version is running.</w:t>
+        <w:t xml:space="preserve">in Ubuntu Terminal  : </w:t>
+      </w:r>
+      <w:r>
+        <w:t>lsb_release -a</w:t>
+      </w:r>
+      <w:r>
+        <w:t xml:space="preserve">  , details which Ubuntu version is running.</w:t>
       </w:r>
     </w:p>
     <w:p>
@@ -221,11 +179,9 @@
       <w:r>
         <w:t xml:space="preserve"> + </w:t>
       </w:r>
-      <w:proofErr w:type="spellStart"/>
       <w:r>
         <w:t>uv</w:t>
       </w:r>
-      <w:proofErr w:type="spellEnd"/>
       <w:r>
         <w:t xml:space="preserve"> </w:t>
       </w:r>
@@ -239,21 +195,8 @@
         </w:numPr>
       </w:pPr>
       <w:r>
-        <w:t>curl -</w:t>
-      </w:r>
-      <w:proofErr w:type="spellStart"/>
-      <w:r>
-        <w:t>LsSf</w:t>
-      </w:r>
-      <w:proofErr w:type="spellEnd"/>
-      <w:r>
-        <w:t xml:space="preserve"> https://astral.sh/uv/install.sh | </w:t>
-      </w:r>
-      <w:proofErr w:type="spellStart"/>
-      <w:r>
-        <w:t>sh</w:t>
-      </w:r>
-      <w:proofErr w:type="spellEnd"/>
+        <w:t>curl -LsSf https://astral.sh/uv/install.sh | sh</w:t>
+      </w:r>
     </w:p>
     <w:p>
       <w:pPr>
@@ -264,18 +207,8 @@
         </w:numPr>
       </w:pPr>
       <w:r>
-        <w:t>source ~</w:t>
-      </w:r>
-      <w:proofErr w:type="gramStart"/>
-      <w:r>
-        <w:t>/.</w:t>
-      </w:r>
-      <w:proofErr w:type="spellStart"/>
-      <w:r>
-        <w:t>bashrc</w:t>
-      </w:r>
-      <w:proofErr w:type="spellEnd"/>
-      <w:proofErr w:type="gramEnd"/>
+        <w:t>source ~/.bashrc</w:t>
+      </w:r>
     </w:p>
     <w:p>
       <w:pPr>
@@ -285,13 +218,8 @@
           <w:numId w:val="3"/>
         </w:numPr>
       </w:pPr>
-      <w:proofErr w:type="spellStart"/>
-      <w:r>
-        <w:t>uv</w:t>
-      </w:r>
-      <w:proofErr w:type="spellEnd"/>
-      <w:r>
-        <w:t xml:space="preserve"> </w:t>
+      <w:r>
+        <w:t xml:space="preserve">uv </w:t>
       </w:r>
       <w:r>
         <w:t>–</w:t>
@@ -313,37 +241,17 @@
         <w:pStyle w:val="ListParagraph"/>
         <w:ind w:left="1440"/>
       </w:pPr>
-      <w:proofErr w:type="spellStart"/>
-      <w:r>
-        <w:t>uv</w:t>
-      </w:r>
-      <w:proofErr w:type="spellEnd"/>
-      <w:r>
-        <w:t xml:space="preserve"> </w:t>
-      </w:r>
-      <w:proofErr w:type="spellStart"/>
-      <w:r>
-        <w:t>venv</w:t>
-      </w:r>
-      <w:proofErr w:type="spellEnd"/>
+      <w:r>
+        <w:t>uv venv</w:t>
+      </w:r>
     </w:p>
     <w:p>
       <w:pPr>
         <w:pStyle w:val="ListParagraph"/>
         <w:ind w:left="1440"/>
       </w:pPr>
-      <w:proofErr w:type="gramStart"/>
-      <w:r>
-        <w:t>source .</w:t>
-      </w:r>
-      <w:proofErr w:type="spellStart"/>
-      <w:r>
-        <w:t>venv</w:t>
-      </w:r>
-      <w:proofErr w:type="spellEnd"/>
-      <w:proofErr w:type="gramEnd"/>
-      <w:r>
-        <w:t>/bin/activate</w:t>
+      <w:r>
+        <w:t>source .venv/bin/activate</w:t>
       </w:r>
     </w:p>
     <w:p>
@@ -359,13 +267,8 @@
       <w:pPr>
         <w:ind w:firstLine="720"/>
       </w:pPr>
-      <w:proofErr w:type="spellStart"/>
-      <w:r>
-        <w:t>sudo</w:t>
-      </w:r>
-      <w:proofErr w:type="spellEnd"/>
-      <w:r>
-        <w:t xml:space="preserve"> apt install openjdk-17-jdk -y</w:t>
+      <w:r>
+        <w:t>sudo apt install openjdk-17-jdk -y</w:t>
       </w:r>
     </w:p>
     <w:p>
@@ -397,13 +300,8 @@
         </w:numPr>
         <w:ind w:left="1080"/>
       </w:pPr>
-      <w:proofErr w:type="spellStart"/>
-      <w:r>
-        <w:t>mkdir</w:t>
-      </w:r>
-      <w:proofErr w:type="spellEnd"/>
-      <w:r>
-        <w:t xml:space="preserve"> -p ~/</w:t>
+      <w:r>
+        <w:t>mkdir -p ~/</w:t>
       </w:r>
       <w:r>
         <w:t>apps</w:t>
@@ -442,13 +340,8 @@
         </w:numPr>
         <w:ind w:left="1080"/>
       </w:pPr>
-      <w:proofErr w:type="spellStart"/>
-      <w:r>
-        <w:t>wget</w:t>
-      </w:r>
-      <w:proofErr w:type="spellEnd"/>
-      <w:r>
-        <w:t xml:space="preserve"> </w:t>
+      <w:r>
+        <w:t xml:space="preserve">wget </w:t>
       </w:r>
       <w:hyperlink r:id="rId6" w:history="1">
         <w:r>
@@ -478,15 +371,7 @@
       </w:pPr>
       <w:r>
         <w:lastRenderedPageBreak/>
-        <w:t>tar -</w:t>
-      </w:r>
-      <w:proofErr w:type="spellStart"/>
-      <w:r>
-        <w:t>xzf</w:t>
-      </w:r>
-      <w:proofErr w:type="spellEnd"/>
-      <w:r>
-        <w:t xml:space="preserve"> spark-4.1.2-bin-hadoop3.tgz</w:t>
+        <w:t>tar -xzf spark-4.1.2-bin-hadoop3.tgz</w:t>
       </w:r>
       <w:r>
         <w:br/>
@@ -504,23 +389,10 @@
         <w:t xml:space="preserve">         </w:t>
       </w:r>
       <w:r>
-        <w:t>nano ~</w:t>
-      </w:r>
-      <w:proofErr w:type="gramStart"/>
-      <w:r>
-        <w:t>/.</w:t>
-      </w:r>
-      <w:proofErr w:type="spellStart"/>
-      <w:r>
-        <w:t>bashrc</w:t>
-      </w:r>
-      <w:proofErr w:type="spellEnd"/>
-      <w:r>
-        <w:t xml:space="preserve">  ,</w:t>
-      </w:r>
-      <w:proofErr w:type="gramEnd"/>
-      <w:r>
-        <w:t xml:space="preserve"> this will open file to add below </w:t>
+        <w:t>nano ~/.bashrc</w:t>
+      </w:r>
+      <w:r>
+        <w:t xml:space="preserve">  , this will open file to add below </w:t>
       </w:r>
     </w:p>
     <w:p>
@@ -532,23 +404,7 @@
         </w:numPr>
       </w:pPr>
       <w:r>
-        <w:t>export JAVA_HOME=/</w:t>
-      </w:r>
-      <w:proofErr w:type="spellStart"/>
-      <w:r>
-        <w:t>usr</w:t>
-      </w:r>
-      <w:proofErr w:type="spellEnd"/>
-      <w:r>
-        <w:t>/lib/</w:t>
-      </w:r>
-      <w:proofErr w:type="spellStart"/>
-      <w:r>
-        <w:t>jvm</w:t>
-      </w:r>
-      <w:proofErr w:type="spellEnd"/>
-      <w:r>
-        <w:t>/java-17-openjdk-amd64</w:t>
+        <w:t>export JAVA_HOME=/usr/lib/jvm/java-17-openjdk-amd64</w:t>
       </w:r>
     </w:p>
     <w:p>
@@ -572,36 +428,7 @@
         </w:numPr>
       </w:pPr>
       <w:r>
-        <w:t>export PATH=$JAVA_HOME/</w:t>
-      </w:r>
-      <w:proofErr w:type="gramStart"/>
-      <w:r>
-        <w:t>bin:$</w:t>
-      </w:r>
-      <w:proofErr w:type="gramEnd"/>
-      <w:r>
-        <w:t>SPARK_HOME/</w:t>
-      </w:r>
-      <w:proofErr w:type="gramStart"/>
-      <w:r>
-        <w:t>bin:$</w:t>
-      </w:r>
-      <w:proofErr w:type="gramEnd"/>
-      <w:r>
-        <w:t>SPARK_HOME/</w:t>
-      </w:r>
-      <w:proofErr w:type="spellStart"/>
-      <w:proofErr w:type="gramStart"/>
-      <w:r>
-        <w:t>sbin</w:t>
-      </w:r>
-      <w:proofErr w:type="spellEnd"/>
-      <w:r>
-        <w:t>:$</w:t>
-      </w:r>
-      <w:proofErr w:type="gramEnd"/>
-      <w:r>
-        <w:t>PATH</w:t>
+        <w:t>export PATH=$JAVA_HOME/bin:$SPARK_HOME/bin:$SPARK_HOME/sbin:$PATH</w:t>
       </w:r>
     </w:p>
     <w:p>
@@ -609,18 +436,8 @@
         <w:ind w:left="1080"/>
       </w:pPr>
       <w:r>
-        <w:t>source ~</w:t>
-      </w:r>
-      <w:proofErr w:type="gramStart"/>
-      <w:r>
-        <w:t>/.</w:t>
-      </w:r>
-      <w:proofErr w:type="spellStart"/>
-      <w:r>
-        <w:t>bashrc</w:t>
-      </w:r>
-      <w:proofErr w:type="spellEnd"/>
-      <w:proofErr w:type="gramEnd"/>
+        <w:t>source ~/.bashrc</w:t>
+      </w:r>
       <w:r>
         <w:t xml:space="preserve"> , load the file again.</w:t>
       </w:r>
@@ -667,20 +484,7 @@
     </w:p>
     <w:p>
       <w:r>
-        <w:t xml:space="preserve">Both from Microsoft </w:t>
-      </w:r>
-      <w:proofErr w:type="gramStart"/>
-      <w:r>
-        <w:t>store(</w:t>
-      </w:r>
-      <w:proofErr w:type="spellStart"/>
-      <w:proofErr w:type="gramEnd"/>
-      <w:r>
-        <w:t>VSCode</w:t>
-      </w:r>
-      <w:proofErr w:type="spellEnd"/>
-      <w:r>
-        <w:t xml:space="preserve"> + Docker)</w:t>
+        <w:t>Both from Microsoft store(VSCode + Docker)</w:t>
       </w:r>
     </w:p>
     <w:p>
@@ -691,15 +495,7 @@
         <w:t>VS Code</w:t>
       </w:r>
       <w:r>
-        <w:t xml:space="preserve"> + WSL </w:t>
-      </w:r>
-      <w:proofErr w:type="gramStart"/>
-      <w:r>
-        <w:t>Integration(</w:t>
-      </w:r>
-      <w:proofErr w:type="gramEnd"/>
-      <w:r>
-        <w:t>just click on connect with WSL)</w:t>
+        <w:t xml:space="preserve"> + WSL Integration(just click on connect with WSL)</w:t>
       </w:r>
     </w:p>
     <w:p>
@@ -707,21 +503,19 @@
         <w:t xml:space="preserve">Extension: </w:t>
       </w:r>
       <w:r>
-        <w:t xml:space="preserve">Jupyter + </w:t>
-      </w:r>
-      <w:proofErr w:type="gramStart"/>
-      <w:r>
-        <w:t>PyLance</w:t>
+        <w:t>Jupyter + PyLance</w:t>
+      </w:r>
+      <w:r>
+        <w:t xml:space="preserve"> + Python</w:t>
       </w:r>
       <w:r>
         <w:t xml:space="preserve"> </w:t>
       </w:r>
       <w:r>
-        <w:t>,</w:t>
-      </w:r>
-      <w:proofErr w:type="gramEnd"/>
-      <w:r>
-        <w:t xml:space="preserve"> SQLite</w:t>
+        <w:t>, SQLite</w:t>
+      </w:r>
+      <w:r>
+        <w:t xml:space="preserve"> – all in when wsl enabled so that it will install in ubuntu rather than windows.</w:t>
       </w:r>
     </w:p>
     <w:p>
@@ -830,15 +624,7 @@
         <w:ind w:left="1440"/>
       </w:pPr>
       <w:r>
-        <w:t xml:space="preserve">Apply &amp; </w:t>
-      </w:r>
-      <w:proofErr w:type="gramStart"/>
-      <w:r>
-        <w:t>Restart</w:t>
-      </w:r>
-      <w:proofErr w:type="gramEnd"/>
-      <w:r>
-        <w:t>.</w:t>
+        <w:t>Apply &amp; Restart.</w:t>
       </w:r>
     </w:p>
     <w:p>

</xml_diff>